<commit_message>
Maybe last update on documentation
</commit_message>
<xml_diff>
--- a/Zdeněk_Vostrovský_4ITC.docx
+++ b/Zdeněk_Vostrovský_4ITC.docx
@@ -942,7 +942,7 @@
           <w:r>
             <w:fldChar w:fldCharType="separate"/>
           </w:r>
-          <w:hyperlink w:anchor="_Toc187650058" w:history="1">
+          <w:hyperlink w:anchor="_Toc187737778" w:history="1">
             <w:r>
               <w:rPr>
                 <w:rStyle w:val="Hypertextovodkaz"/>
@@ -969,7 +969,7 @@
                 <w:noProof/>
                 <w:webHidden/>
               </w:rPr>
-              <w:instrText xml:space="preserve"> PAGEREF _Toc187650058 \h </w:instrText>
+              <w:instrText xml:space="preserve"> PAGEREF _Toc187737778 \h </w:instrText>
             </w:r>
             <w:r>
               <w:rPr>
@@ -1016,7 +1016,7 @@
               <w14:ligatures w14:val="standardContextual"/>
             </w:rPr>
           </w:pPr>
-          <w:hyperlink w:anchor="_Toc187650059" w:history="1">
+          <w:hyperlink w:anchor="_Toc187737779" w:history="1">
             <w:r>
               <w:rPr>
                 <w:rStyle w:val="Hypertextovodkaz"/>
@@ -1061,7 +1061,7 @@
                 <w:noProof/>
                 <w:webHidden/>
               </w:rPr>
-              <w:instrText xml:space="preserve"> PAGEREF _Toc187650059 \h </w:instrText>
+              <w:instrText xml:space="preserve"> PAGEREF _Toc187737779 \h </w:instrText>
             </w:r>
             <w:r>
               <w:rPr>
@@ -1108,7 +1108,7 @@
               <w14:ligatures w14:val="standardContextual"/>
             </w:rPr>
           </w:pPr>
-          <w:hyperlink w:anchor="_Toc187650060" w:history="1">
+          <w:hyperlink w:anchor="_Toc187737780" w:history="1">
             <w:r>
               <w:rPr>
                 <w:rStyle w:val="Hypertextovodkaz"/>
@@ -1153,7 +1153,7 @@
                 <w:noProof/>
                 <w:webHidden/>
               </w:rPr>
-              <w:instrText xml:space="preserve"> PAGEREF _Toc187650060 \h </w:instrText>
+              <w:instrText xml:space="preserve"> PAGEREF _Toc187737780 \h </w:instrText>
             </w:r>
             <w:r>
               <w:rPr>
@@ -1200,7 +1200,7 @@
               <w14:ligatures w14:val="standardContextual"/>
             </w:rPr>
           </w:pPr>
-          <w:hyperlink w:anchor="_Toc187650061" w:history="1">
+          <w:hyperlink w:anchor="_Toc187737781" w:history="1">
             <w:r>
               <w:rPr>
                 <w:rStyle w:val="Hypertextovodkaz"/>
@@ -1245,7 +1245,7 @@
                 <w:noProof/>
                 <w:webHidden/>
               </w:rPr>
-              <w:instrText xml:space="preserve"> PAGEREF _Toc187650061 \h </w:instrText>
+              <w:instrText xml:space="preserve"> PAGEREF _Toc187737781 \h </w:instrText>
             </w:r>
             <w:r>
               <w:rPr>
@@ -1292,7 +1292,7 @@
               <w14:ligatures w14:val="standardContextual"/>
             </w:rPr>
           </w:pPr>
-          <w:hyperlink w:anchor="_Toc187650062" w:history="1">
+          <w:hyperlink w:anchor="_Toc187737782" w:history="1">
             <w:r>
               <w:rPr>
                 <w:rStyle w:val="Hypertextovodkaz"/>
@@ -1337,7 +1337,7 @@
                 <w:noProof/>
                 <w:webHidden/>
               </w:rPr>
-              <w:instrText xml:space="preserve"> PAGEREF _Toc187650062 \h </w:instrText>
+              <w:instrText xml:space="preserve"> PAGEREF _Toc187737782 \h </w:instrText>
             </w:r>
             <w:r>
               <w:rPr>
@@ -1384,7 +1384,7 @@
               <w14:ligatures w14:val="standardContextual"/>
             </w:rPr>
           </w:pPr>
-          <w:hyperlink w:anchor="_Toc187650063" w:history="1">
+          <w:hyperlink w:anchor="_Toc187737783" w:history="1">
             <w:r>
               <w:rPr>
                 <w:rStyle w:val="Hypertextovodkaz"/>
@@ -1429,7 +1429,7 @@
                 <w:noProof/>
                 <w:webHidden/>
               </w:rPr>
-              <w:instrText xml:space="preserve"> PAGEREF _Toc187650063 \h </w:instrText>
+              <w:instrText xml:space="preserve"> PAGEREF _Toc187737783 \h </w:instrText>
             </w:r>
             <w:r>
               <w:rPr>
@@ -1476,7 +1476,7 @@
               <w14:ligatures w14:val="standardContextual"/>
             </w:rPr>
           </w:pPr>
-          <w:hyperlink w:anchor="_Toc187650064" w:history="1">
+          <w:hyperlink w:anchor="_Toc187737784" w:history="1">
             <w:r>
               <w:rPr>
                 <w:rStyle w:val="Hypertextovodkaz"/>
@@ -1521,7 +1521,7 @@
                 <w:noProof/>
                 <w:webHidden/>
               </w:rPr>
-              <w:instrText xml:space="preserve"> PAGEREF _Toc187650064 \h </w:instrText>
+              <w:instrText xml:space="preserve"> PAGEREF _Toc187737784 \h </w:instrText>
             </w:r>
             <w:r>
               <w:rPr>
@@ -1568,7 +1568,7 @@
               <w14:ligatures w14:val="standardContextual"/>
             </w:rPr>
           </w:pPr>
-          <w:hyperlink w:anchor="_Toc187650065" w:history="1">
+          <w:hyperlink w:anchor="_Toc187737785" w:history="1">
             <w:r>
               <w:rPr>
                 <w:rStyle w:val="Hypertextovodkaz"/>
@@ -1613,7 +1613,7 @@
                 <w:noProof/>
                 <w:webHidden/>
               </w:rPr>
-              <w:instrText xml:space="preserve"> PAGEREF _Toc187650065 \h </w:instrText>
+              <w:instrText xml:space="preserve"> PAGEREF _Toc187737785 \h </w:instrText>
             </w:r>
             <w:r>
               <w:rPr>
@@ -1660,7 +1660,7 @@
               <w14:ligatures w14:val="standardContextual"/>
             </w:rPr>
           </w:pPr>
-          <w:hyperlink w:anchor="_Toc187650066" w:history="1">
+          <w:hyperlink w:anchor="_Toc187737786" w:history="1">
             <w:r>
               <w:rPr>
                 <w:rStyle w:val="Hypertextovodkaz"/>
@@ -1705,7 +1705,7 @@
                 <w:noProof/>
                 <w:webHidden/>
               </w:rPr>
-              <w:instrText xml:space="preserve"> PAGEREF _Toc187650066 \h </w:instrText>
+              <w:instrText xml:space="preserve"> PAGEREF _Toc187737786 \h </w:instrText>
             </w:r>
             <w:r>
               <w:rPr>
@@ -1752,7 +1752,7 @@
               <w14:ligatures w14:val="standardContextual"/>
             </w:rPr>
           </w:pPr>
-          <w:hyperlink w:anchor="_Toc187650067" w:history="1">
+          <w:hyperlink w:anchor="_Toc187737787" w:history="1">
             <w:r>
               <w:rPr>
                 <w:rStyle w:val="Hypertextovodkaz"/>
@@ -1797,7 +1797,7 @@
                 <w:noProof/>
                 <w:webHidden/>
               </w:rPr>
-              <w:instrText xml:space="preserve"> PAGEREF _Toc187650067 \h </w:instrText>
+              <w:instrText xml:space="preserve"> PAGEREF _Toc187737787 \h </w:instrText>
             </w:r>
             <w:r>
               <w:rPr>
@@ -1844,7 +1844,7 @@
               <w14:ligatures w14:val="standardContextual"/>
             </w:rPr>
           </w:pPr>
-          <w:hyperlink w:anchor="_Toc187650068" w:history="1">
+          <w:hyperlink w:anchor="_Toc187737788" w:history="1">
             <w:r>
               <w:rPr>
                 <w:rStyle w:val="Hypertextovodkaz"/>
@@ -1889,7 +1889,7 @@
                 <w:noProof/>
                 <w:webHidden/>
               </w:rPr>
-              <w:instrText xml:space="preserve"> PAGEREF _Toc187650068 \h </w:instrText>
+              <w:instrText xml:space="preserve"> PAGEREF _Toc187737788 \h </w:instrText>
             </w:r>
             <w:r>
               <w:rPr>
@@ -1936,7 +1936,7 @@
               <w14:ligatures w14:val="standardContextual"/>
             </w:rPr>
           </w:pPr>
-          <w:hyperlink w:anchor="_Toc187650069" w:history="1">
+          <w:hyperlink w:anchor="_Toc187737789" w:history="1">
             <w:r>
               <w:rPr>
                 <w:rStyle w:val="Hypertextovodkaz"/>
@@ -1981,7 +1981,7 @@
                 <w:noProof/>
                 <w:webHidden/>
               </w:rPr>
-              <w:instrText xml:space="preserve"> PAGEREF _Toc187650069 \h </w:instrText>
+              <w:instrText xml:space="preserve"> PAGEREF _Toc187737789 \h </w:instrText>
             </w:r>
             <w:r>
               <w:rPr>
@@ -2028,7 +2028,7 @@
               <w14:ligatures w14:val="standardContextual"/>
             </w:rPr>
           </w:pPr>
-          <w:hyperlink w:anchor="_Toc187650070" w:history="1">
+          <w:hyperlink w:anchor="_Toc187737790" w:history="1">
             <w:r>
               <w:rPr>
                 <w:rStyle w:val="Hypertextovodkaz"/>
@@ -2073,7 +2073,7 @@
                 <w:noProof/>
                 <w:webHidden/>
               </w:rPr>
-              <w:instrText xml:space="preserve"> PAGEREF _Toc187650070 \h </w:instrText>
+              <w:instrText xml:space="preserve"> PAGEREF _Toc187737790 \h </w:instrText>
             </w:r>
             <w:r>
               <w:rPr>
@@ -2120,7 +2120,7 @@
               <w14:ligatures w14:val="standardContextual"/>
             </w:rPr>
           </w:pPr>
-          <w:hyperlink w:anchor="_Toc187650071" w:history="1">
+          <w:hyperlink w:anchor="_Toc187737791" w:history="1">
             <w:r>
               <w:rPr>
                 <w:rStyle w:val="Hypertextovodkaz"/>
@@ -2165,7 +2165,7 @@
                 <w:noProof/>
                 <w:webHidden/>
               </w:rPr>
-              <w:instrText xml:space="preserve"> PAGEREF _Toc187650071 \h </w:instrText>
+              <w:instrText xml:space="preserve"> PAGEREF _Toc187737791 \h </w:instrText>
             </w:r>
             <w:r>
               <w:rPr>
@@ -2212,7 +2212,7 @@
               <w14:ligatures w14:val="standardContextual"/>
             </w:rPr>
           </w:pPr>
-          <w:hyperlink w:anchor="_Toc187650072" w:history="1">
+          <w:hyperlink w:anchor="_Toc187737792" w:history="1">
             <w:r>
               <w:rPr>
                 <w:rStyle w:val="Hypertextovodkaz"/>
@@ -2257,7 +2257,7 @@
                 <w:noProof/>
                 <w:webHidden/>
               </w:rPr>
-              <w:instrText xml:space="preserve"> PAGEREF _Toc187650072 \h </w:instrText>
+              <w:instrText xml:space="preserve"> PAGEREF _Toc187737792 \h </w:instrText>
             </w:r>
             <w:r>
               <w:rPr>
@@ -2304,7 +2304,7 @@
               <w14:ligatures w14:val="standardContextual"/>
             </w:rPr>
           </w:pPr>
-          <w:hyperlink w:anchor="_Toc187650073" w:history="1">
+          <w:hyperlink w:anchor="_Toc187737793" w:history="1">
             <w:r>
               <w:rPr>
                 <w:rStyle w:val="Hypertextovodkaz"/>
@@ -2349,7 +2349,7 @@
                 <w:noProof/>
                 <w:webHidden/>
               </w:rPr>
-              <w:instrText xml:space="preserve"> PAGEREF _Toc187650073 \h </w:instrText>
+              <w:instrText xml:space="preserve"> PAGEREF _Toc187737793 \h </w:instrText>
             </w:r>
             <w:r>
               <w:rPr>
@@ -2396,7 +2396,7 @@
               <w14:ligatures w14:val="standardContextual"/>
             </w:rPr>
           </w:pPr>
-          <w:hyperlink w:anchor="_Toc187650074" w:history="1">
+          <w:hyperlink w:anchor="_Toc187737794" w:history="1">
             <w:r>
               <w:rPr>
                 <w:rStyle w:val="Hypertextovodkaz"/>
@@ -2441,7 +2441,7 @@
                 <w:noProof/>
                 <w:webHidden/>
               </w:rPr>
-              <w:instrText xml:space="preserve"> PAGEREF _Toc187650074 \h </w:instrText>
+              <w:instrText xml:space="preserve"> PAGEREF _Toc187737794 \h </w:instrText>
             </w:r>
             <w:r>
               <w:rPr>
@@ -2462,6 +2462,98 @@
                 <w:webHidden/>
               </w:rPr>
               <w:t>13</w:t>
+            </w:r>
+            <w:r>
+              <w:rPr>
+                <w:noProof/>
+                <w:webHidden/>
+              </w:rPr>
+              <w:fldChar w:fldCharType="end"/>
+            </w:r>
+          </w:hyperlink>
+        </w:p>
+        <w:p>
+          <w:pPr>
+            <w:pStyle w:val="Obsah3"/>
+            <w:tabs>
+              <w:tab w:val="left" w:pos="1200"/>
+              <w:tab w:val="right" w:leader="dot" w:pos="9062"/>
+            </w:tabs>
+            <w:rPr>
+              <w:noProof/>
+              <w:kern w:val="2"/>
+              <w:sz w:val="24"/>
+              <w:szCs w:val="24"/>
+              <w:lang w:eastAsia="cs-CZ"/>
+              <w14:ligatures w14:val="standardContextual"/>
+            </w:rPr>
+          </w:pPr>
+          <w:hyperlink w:anchor="_Toc187737795" w:history="1">
+            <w:r>
+              <w:rPr>
+                <w:rStyle w:val="Hypertextovodkaz"/>
+                <w:noProof/>
+              </w:rPr>
+              <w:t>2.2.2</w:t>
+            </w:r>
+            <w:r>
+              <w:rPr>
+                <w:noProof/>
+                <w:kern w:val="2"/>
+                <w:sz w:val="24"/>
+                <w:szCs w:val="24"/>
+                <w:lang w:eastAsia="cs-CZ"/>
+                <w14:ligatures w14:val="standardContextual"/>
+              </w:rPr>
+              <w:tab/>
+            </w:r>
+            <w:r>
+              <w:rPr>
+                <w:rStyle w:val="Hypertextovodkaz"/>
+                <w:noProof/>
+              </w:rPr>
+              <w:t>Ragdoll kolize</w:t>
+            </w:r>
+            <w:r>
+              <w:rPr>
+                <w:noProof/>
+                <w:webHidden/>
+              </w:rPr>
+              <w:tab/>
+            </w:r>
+            <w:r>
+              <w:rPr>
+                <w:noProof/>
+                <w:webHidden/>
+              </w:rPr>
+              <w:fldChar w:fldCharType="begin"/>
+            </w:r>
+            <w:r>
+              <w:rPr>
+                <w:noProof/>
+                <w:webHidden/>
+              </w:rPr>
+              <w:instrText xml:space="preserve"> PAGEREF _Toc187737795 \h </w:instrText>
+            </w:r>
+            <w:r>
+              <w:rPr>
+                <w:noProof/>
+                <w:webHidden/>
+              </w:rPr>
+            </w:r>
+            <w:r>
+              <w:rPr>
+                <w:noProof/>
+                <w:webHidden/>
+              </w:rPr>
+              <w:fldChar w:fldCharType="separate"/>
+            </w:r>
+            <w:r>
+              <w:rPr>
+                <w:noProof/>
+                <w:webHidden/>
+              </w:rPr>
+              <w:t>15</w:t>
             </w:r>
             <w:r>
               <w:rPr>
@@ -2488,7 +2580,7 @@
               <w14:ligatures w14:val="standardContextual"/>
             </w:rPr>
           </w:pPr>
-          <w:hyperlink w:anchor="_Toc187650075" w:history="1">
+          <w:hyperlink w:anchor="_Toc187737796" w:history="1">
             <w:r>
               <w:rPr>
                 <w:rStyle w:val="Hypertextovodkaz"/>
@@ -2533,7 +2625,7 @@
                 <w:noProof/>
                 <w:webHidden/>
               </w:rPr>
-              <w:instrText xml:space="preserve"> PAGEREF _Toc187650075 \h </w:instrText>
+              <w:instrText xml:space="preserve"> PAGEREF _Toc187737796 \h </w:instrText>
             </w:r>
             <w:r>
               <w:rPr>
@@ -2580,7 +2672,7 @@
               <w14:ligatures w14:val="standardContextual"/>
             </w:rPr>
           </w:pPr>
-          <w:hyperlink w:anchor="_Toc187650076" w:history="1">
+          <w:hyperlink w:anchor="_Toc187737797" w:history="1">
             <w:r>
               <w:rPr>
                 <w:rStyle w:val="Hypertextovodkaz"/>
@@ -2625,7 +2717,7 @@
                 <w:noProof/>
                 <w:webHidden/>
               </w:rPr>
-              <w:instrText xml:space="preserve"> PAGEREF _Toc187650076 \h </w:instrText>
+              <w:instrText xml:space="preserve"> PAGEREF _Toc187737797 \h </w:instrText>
             </w:r>
             <w:r>
               <w:rPr>
@@ -2671,7 +2763,7 @@
               <w14:ligatures w14:val="standardContextual"/>
             </w:rPr>
           </w:pPr>
-          <w:hyperlink w:anchor="_Toc187650077" w:history="1">
+          <w:hyperlink w:anchor="_Toc187737798" w:history="1">
             <w:r>
               <w:rPr>
                 <w:rStyle w:val="Hypertextovodkaz"/>
@@ -2698,7 +2790,7 @@
                 <w:noProof/>
                 <w:webHidden/>
               </w:rPr>
-              <w:instrText xml:space="preserve"> PAGEREF _Toc187650077 \h </w:instrText>
+              <w:instrText xml:space="preserve"> PAGEREF _Toc187737798 \h </w:instrText>
             </w:r>
             <w:r>
               <w:rPr>
@@ -2719,6 +2811,98 @@
                 <w:webHidden/>
               </w:rPr>
               <w:t>17</w:t>
+            </w:r>
+            <w:r>
+              <w:rPr>
+                <w:noProof/>
+                <w:webHidden/>
+              </w:rPr>
+              <w:fldChar w:fldCharType="end"/>
+            </w:r>
+          </w:hyperlink>
+        </w:p>
+        <w:p>
+          <w:pPr>
+            <w:pStyle w:val="Obsah1"/>
+            <w:tabs>
+              <w:tab w:val="left" w:pos="440"/>
+              <w:tab w:val="right" w:leader="dot" w:pos="9062"/>
+            </w:tabs>
+            <w:rPr>
+              <w:noProof/>
+              <w:kern w:val="2"/>
+              <w:sz w:val="24"/>
+              <w:szCs w:val="24"/>
+              <w:lang w:eastAsia="cs-CZ"/>
+              <w14:ligatures w14:val="standardContextual"/>
+            </w:rPr>
+          </w:pPr>
+          <w:hyperlink w:anchor="_Toc187737799" w:history="1">
+            <w:r>
+              <w:rPr>
+                <w:rStyle w:val="Hypertextovodkaz"/>
+                <w:noProof/>
+              </w:rPr>
+              <w:t>3</w:t>
+            </w:r>
+            <w:r>
+              <w:rPr>
+                <w:noProof/>
+                <w:kern w:val="2"/>
+                <w:sz w:val="24"/>
+                <w:szCs w:val="24"/>
+                <w:lang w:eastAsia="cs-CZ"/>
+                <w14:ligatures w14:val="standardContextual"/>
+              </w:rPr>
+              <w:tab/>
+            </w:r>
+            <w:r>
+              <w:rPr>
+                <w:rStyle w:val="Hypertextovodkaz"/>
+                <w:noProof/>
+              </w:rPr>
+              <w:t>Použitá literatura</w:t>
+            </w:r>
+            <w:r>
+              <w:rPr>
+                <w:noProof/>
+                <w:webHidden/>
+              </w:rPr>
+              <w:tab/>
+            </w:r>
+            <w:r>
+              <w:rPr>
+                <w:noProof/>
+                <w:webHidden/>
+              </w:rPr>
+              <w:fldChar w:fldCharType="begin"/>
+            </w:r>
+            <w:r>
+              <w:rPr>
+                <w:noProof/>
+                <w:webHidden/>
+              </w:rPr>
+              <w:instrText xml:space="preserve"> PAGEREF _Toc187737799 \h </w:instrText>
+            </w:r>
+            <w:r>
+              <w:rPr>
+                <w:noProof/>
+                <w:webHidden/>
+              </w:rPr>
+            </w:r>
+            <w:r>
+              <w:rPr>
+                <w:noProof/>
+                <w:webHidden/>
+              </w:rPr>
+              <w:fldChar w:fldCharType="separate"/>
+            </w:r>
+            <w:r>
+              <w:rPr>
+                <w:noProof/>
+                <w:webHidden/>
+              </w:rPr>
+              <w:t>18</w:t>
             </w:r>
             <w:r>
               <w:rPr>
@@ -2744,13 +2928,13 @@
               <w14:ligatures w14:val="standardContextual"/>
             </w:rPr>
           </w:pPr>
-          <w:hyperlink w:anchor="_Toc187650078" w:history="1">
+          <w:hyperlink w:anchor="_Toc187737800" w:history="1">
             <w:r>
               <w:rPr>
                 <w:rStyle w:val="Hypertextovodkaz"/>
                 <w:noProof/>
               </w:rPr>
-              <w:t>Použitá literatura</w:t>
+              <w:t>Seznam obrázků</w:t>
             </w:r>
             <w:r>
               <w:rPr>
@@ -2771,7 +2955,7 @@
                 <w:noProof/>
                 <w:webHidden/>
               </w:rPr>
-              <w:instrText xml:space="preserve"> PAGEREF _Toc187650078 \h </w:instrText>
+              <w:instrText xml:space="preserve"> PAGEREF _Toc187737800 \h </w:instrText>
             </w:r>
             <w:r>
               <w:rPr>
@@ -2791,7 +2975,7 @@
                 <w:noProof/>
                 <w:webHidden/>
               </w:rPr>
-              <w:t>18</w:t>
+              <w:t>20</w:t>
             </w:r>
             <w:r>
               <w:rPr>
@@ -2817,13 +3001,13 @@
               <w14:ligatures w14:val="standardContextual"/>
             </w:rPr>
           </w:pPr>
-          <w:hyperlink w:anchor="_Toc187650079" w:history="1">
+          <w:hyperlink w:anchor="_Toc187737801" w:history="1">
             <w:r>
               <w:rPr>
                 <w:rStyle w:val="Hypertextovodkaz"/>
                 <w:noProof/>
               </w:rPr>
-              <w:t>Seznam obrázků</w:t>
+              <w:t>Obsah média</w:t>
             </w:r>
             <w:r>
               <w:rPr>
@@ -2844,7 +3028,7 @@
                 <w:noProof/>
                 <w:webHidden/>
               </w:rPr>
-              <w:instrText xml:space="preserve"> PAGEREF _Toc187650079 \h </w:instrText>
+              <w:instrText xml:space="preserve"> PAGEREF _Toc187737801 \h </w:instrText>
             </w:r>
             <w:r>
               <w:rPr>
@@ -2864,80 +3048,7 @@
                 <w:noProof/>
                 <w:webHidden/>
               </w:rPr>
-              <w:t>19</w:t>
-            </w:r>
-            <w:r>
-              <w:rPr>
-                <w:noProof/>
-                <w:webHidden/>
-              </w:rPr>
-              <w:fldChar w:fldCharType="end"/>
-            </w:r>
-          </w:hyperlink>
-        </w:p>
-        <w:p>
-          <w:pPr>
-            <w:pStyle w:val="Obsah1"/>
-            <w:tabs>
-              <w:tab w:val="right" w:leader="dot" w:pos="9062"/>
-            </w:tabs>
-            <w:rPr>
-              <w:noProof/>
-              <w:kern w:val="2"/>
-              <w:sz w:val="24"/>
-              <w:szCs w:val="24"/>
-              <w:lang w:eastAsia="cs-CZ"/>
-              <w14:ligatures w14:val="standardContextual"/>
-            </w:rPr>
-          </w:pPr>
-          <w:hyperlink w:anchor="_Toc187650080" w:history="1">
-            <w:r>
-              <w:rPr>
-                <w:rStyle w:val="Hypertextovodkaz"/>
-                <w:noProof/>
-              </w:rPr>
-              <w:t>Obsah média</w:t>
-            </w:r>
-            <w:r>
-              <w:rPr>
-                <w:noProof/>
-                <w:webHidden/>
-              </w:rPr>
-              <w:tab/>
-            </w:r>
-            <w:r>
-              <w:rPr>
-                <w:noProof/>
-                <w:webHidden/>
-              </w:rPr>
-              <w:fldChar w:fldCharType="begin"/>
-            </w:r>
-            <w:r>
-              <w:rPr>
-                <w:noProof/>
-                <w:webHidden/>
-              </w:rPr>
-              <w:instrText xml:space="preserve"> PAGEREF _Toc187650080 \h </w:instrText>
-            </w:r>
-            <w:r>
-              <w:rPr>
-                <w:noProof/>
-                <w:webHidden/>
-              </w:rPr>
-            </w:r>
-            <w:r>
-              <w:rPr>
-                <w:noProof/>
-                <w:webHidden/>
-              </w:rPr>
-              <w:fldChar w:fldCharType="separate"/>
-            </w:r>
-            <w:r>
-              <w:rPr>
-                <w:noProof/>
-                <w:webHidden/>
-              </w:rPr>
-              <w:t>20</w:t>
+              <w:t>21</w:t>
             </w:r>
             <w:r>
               <w:rPr>
@@ -2976,7 +3087,7 @@
           <w:bottom w:val="single" w:sz="4" w:space="1" w:color="FFC000"/>
         </w:pBdr>
       </w:pPr>
-      <w:bookmarkStart w:id="1" w:name="_Toc187650058"/>
+      <w:bookmarkStart w:id="1" w:name="_Toc187737778"/>
       <w:r>
         <w:lastRenderedPageBreak/>
         <w:t>Ú</w:t>
@@ -3095,7 +3206,7 @@
           <w:bottom w:val="single" w:sz="4" w:space="1" w:color="FFC000"/>
         </w:pBdr>
       </w:pPr>
-      <w:bookmarkStart w:id="2" w:name="_Toc187650059"/>
+      <w:bookmarkStart w:id="2" w:name="_Toc187737779"/>
       <w:r>
         <w:lastRenderedPageBreak/>
         <w:t>Teoretická část</w:t>
@@ -3106,7 +3217,7 @@
       <w:pPr>
         <w:pStyle w:val="Nadpis2"/>
       </w:pPr>
-      <w:bookmarkStart w:id="3" w:name="_Toc187650060"/>
+      <w:bookmarkStart w:id="3" w:name="_Toc187737780"/>
       <w:r>
         <w:t>Rešerše</w:t>
       </w:r>
@@ -3116,7 +3227,7 @@
       <w:pPr>
         <w:pStyle w:val="Nadpis3"/>
       </w:pPr>
-      <w:bookmarkStart w:id="4" w:name="_Toc187650061"/>
+      <w:bookmarkStart w:id="4" w:name="_Toc187737781"/>
       <w:r>
         <w:t>AltF4</w:t>
       </w:r>
@@ -3215,7 +3326,7 @@
                                   <w:rPr>
                                     <w:noProof/>
                                   </w:rPr>
-                                  <w:t xml:space="preserve"> (11)</w:t>
+                                  <w:t xml:space="preserve"> (14)</w:t>
                                 </w:r>
                                 <w:r>
                                   <w:fldChar w:fldCharType="end"/>
@@ -3295,7 +3406,7 @@
                             <w:rPr>
                               <w:noProof/>
                             </w:rPr>
-                            <w:t xml:space="preserve"> (11)</w:t>
+                            <w:t xml:space="preserve"> (14)</w:t>
                           </w:r>
                           <w:r>
                             <w:fldChar w:fldCharType="end"/>
@@ -3503,14 +3614,46 @@
         <w:t xml:space="preserve"> usnadní dokončení mapy. Nakupovat je lze na každém startu mapy na všech mapách.</w:t>
       </w:r>
       <w:r>
-        <w:t xml:space="preserve"> Hra se dočkala i druhého pokračování jménem AltF4 2.</w:t>
+        <w:t xml:space="preserve"> Hra se dočkala i druhého pokračování jménem AltF4 2</w:t>
+      </w:r>
+      <w:r>
+        <w:t xml:space="preserve"> </w:t>
+      </w:r>
+      <w:sdt>
+        <w:sdtPr>
+          <w:id w:val="1426464538"/>
+          <w:citation/>
+        </w:sdtPr>
+        <w:sdtContent>
+          <w:r>
+            <w:fldChar w:fldCharType="begin"/>
+          </w:r>
+          <w:r>
+            <w:instrText xml:space="preserve"> CITATION PRO25 \l 1029 </w:instrText>
+          </w:r>
+          <w:r>
+            <w:fldChar w:fldCharType="separate"/>
+          </w:r>
+          <w:r>
+            <w:rPr>
+              <w:noProof/>
+            </w:rPr>
+            <w:t>(1)</w:t>
+          </w:r>
+          <w:r>
+            <w:fldChar w:fldCharType="end"/>
+          </w:r>
+        </w:sdtContent>
+      </w:sdt>
+      <w:r>
+        <w:t>.</w:t>
       </w:r>
     </w:p>
     <w:p>
       <w:pPr>
         <w:pStyle w:val="Nadpis3"/>
       </w:pPr>
-      <w:bookmarkStart w:id="7" w:name="_Toc187650062"/>
+      <w:bookmarkStart w:id="7" w:name="_Toc187737782"/>
       <w:proofErr w:type="spellStart"/>
       <w:r>
         <w:t>Jump</w:t>
@@ -3624,7 +3767,7 @@
                                   <w:rPr>
                                     <w:noProof/>
                                   </w:rPr>
-                                  <w:t xml:space="preserve"> (12)</w:t>
+                                  <w:t xml:space="preserve"> (15)</w:t>
                                 </w:r>
                                 <w:r>
                                   <w:fldChar w:fldCharType="end"/>
@@ -3709,7 +3852,7 @@
                             <w:rPr>
                               <w:noProof/>
                             </w:rPr>
-                            <w:t xml:space="preserve"> (12)</w:t>
+                            <w:t xml:space="preserve"> (15)</w:t>
                           </w:r>
                           <w:r>
                             <w:fldChar w:fldCharType="end"/>
@@ -3825,7 +3968,39 @@
         <w:t>taktéž</w:t>
       </w:r>
       <w:r>
-        <w:t xml:space="preserve"> úkolem vyskákat několik map. Na každé z těchto map na hlavního hrdinu čeká jeho princezna, kterou chce zachránit a mapu tak dokončit.</w:t>
+        <w:t xml:space="preserve"> úkolem vyskákat několik map. Na každé z těchto map na hlavního hrdinu čeká jeho princezna, kterou chce zachránit a mapu tak dokončit</w:t>
+      </w:r>
+      <w:r>
+        <w:t xml:space="preserve"> </w:t>
+      </w:r>
+      <w:sdt>
+        <w:sdtPr>
+          <w:id w:val="2094266339"/>
+          <w:citation/>
+        </w:sdtPr>
+        <w:sdtContent>
+          <w:r>
+            <w:fldChar w:fldCharType="begin"/>
+          </w:r>
+          <w:r>
+            <w:instrText xml:space="preserve"> CITATION Oso25 \l 1029 </w:instrText>
+          </w:r>
+          <w:r>
+            <w:fldChar w:fldCharType="separate"/>
+          </w:r>
+          <w:r>
+            <w:rPr>
+              <w:noProof/>
+            </w:rPr>
+            <w:t>(2)</w:t>
+          </w:r>
+          <w:r>
+            <w:fldChar w:fldCharType="end"/>
+          </w:r>
+        </w:sdtContent>
+      </w:sdt>
+      <w:r>
+        <w:t>.</w:t>
       </w:r>
     </w:p>
     <w:p>
@@ -3837,7 +4012,7 @@
       <w:pPr>
         <w:pStyle w:val="Nadpis3"/>
       </w:pPr>
-      <w:bookmarkStart w:id="10" w:name="_Toc187650063"/>
+      <w:bookmarkStart w:id="10" w:name="_Toc187737783"/>
       <w:proofErr w:type="spellStart"/>
       <w:r>
         <w:t>Slackers</w:t>
@@ -4047,7 +4222,7 @@
                                   <w:rPr>
                                     <w:noProof/>
                                   </w:rPr>
-                                  <w:t xml:space="preserve"> (13)</w:t>
+                                  <w:t xml:space="preserve"> (16)</w:t>
                                 </w:r>
                                 <w:r>
                                   <w:rPr>
@@ -4143,7 +4318,7 @@
                             <w:rPr>
                               <w:noProof/>
                             </w:rPr>
-                            <w:t xml:space="preserve"> (13)</w:t>
+                            <w:t xml:space="preserve"> (16)</w:t>
                           </w:r>
                           <w:r>
                             <w:rPr>
@@ -4205,11 +4380,43 @@
       </w:r>
       <w:proofErr w:type="spellEnd"/>
       <w:r>
-        <w:t>, taky je to další inspirace pro tento projekt. Ve hře jde o to, že hráč řídí nákupní košík a snaží se vyhýbat všem překážkám po strmé cestě do obchodu. Do obchodu má namířeno kvůli tomu, že si hlavní postava potřebuje koupit pivo, aby mohl hráč odemykat nové mapy. Kolik koupí piva, závisí na tom, za jak dlouho projede hráč danou mapu. Hrát tuto hru zní lehce, jenže to není tak úplně pravda. Dostatečně dobře ovládat košík a do toho jezdit v lepším a lepším časovém rozsahu je obtížnější, než se zdá.</w:t>
+        <w:t>, taky je to další inspirace pro tento projekt. Ve hře jde o to, že hráč řídí nákupní košík a snaží se vyhýbat všem překážkám po strmé cestě do obchodu. Do obchodu má namířeno kvůli tomu, že si hlavní postava potřebuje koupit pivo, aby mohl hráč odemykat nové mapy. Kolik koupí piva, závisí na tom, za jak dlouho projede hráč danou mapu. Hrát tuto hru zní lehce, jenže to není tak úplně pravda. Dostatečně dobře ovládat košík a do toho jezdit v lepším a lepším časovém rozsahu je obtížnější, než se zdá</w:t>
       </w:r>
       <w:r>
         <w:t xml:space="preserve"> </w:t>
       </w:r>
+      <w:sdt>
+        <w:sdtPr>
+          <w:id w:val="-709338772"/>
+          <w:citation/>
+        </w:sdtPr>
+        <w:sdtContent>
+          <w:r>
+            <w:fldChar w:fldCharType="begin"/>
+          </w:r>
+          <w:r>
+            <w:instrText xml:space="preserve"> CITATION PIJ25 \l 1029 </w:instrText>
+          </w:r>
+          <w:r>
+            <w:fldChar w:fldCharType="separate"/>
+          </w:r>
+          <w:r>
+            <w:rPr>
+              <w:noProof/>
+            </w:rPr>
+            <w:t>(3)</w:t>
+          </w:r>
+          <w:r>
+            <w:fldChar w:fldCharType="end"/>
+          </w:r>
+        </w:sdtContent>
+      </w:sdt>
+      <w:r>
+        <w:t>.</w:t>
+      </w:r>
+      <w:r>
+        <w:t xml:space="preserve"> </w:t>
+      </w:r>
       <w:r>
         <w:br w:type="page"/>
       </w:r>
@@ -4218,7 +4425,7 @@
       <w:pPr>
         <w:pStyle w:val="Nadpis2"/>
       </w:pPr>
-      <w:bookmarkStart w:id="13" w:name="_Toc187650064"/>
+      <w:bookmarkStart w:id="13" w:name="_Toc187737784"/>
       <w:r>
         <w:lastRenderedPageBreak/>
         <w:t>Technologie</w:t>
@@ -4229,7 +4436,7 @@
       <w:pPr>
         <w:pStyle w:val="Nadpis3"/>
       </w:pPr>
-      <w:bookmarkStart w:id="14" w:name="_Toc187650065"/>
+      <w:bookmarkStart w:id="14" w:name="_Toc187737785"/>
       <w:r>
         <w:t>Unity</w:t>
       </w:r>
@@ -4335,7 +4542,7 @@
                                   <w:rPr>
                                     <w:noProof/>
                                   </w:rPr>
-                                  <w:t xml:space="preserve"> (14)</w:t>
+                                  <w:t xml:space="preserve"> (17)</w:t>
                                 </w:r>
                                 <w:r>
                                   <w:fldChar w:fldCharType="end"/>
@@ -4416,7 +4623,7 @@
                             <w:rPr>
                               <w:noProof/>
                             </w:rPr>
-                            <w:t xml:space="preserve"> (14)</w:t>
+                            <w:t xml:space="preserve"> (17)</w:t>
                           </w:r>
                           <w:r>
                             <w:fldChar w:fldCharType="end"/>
@@ -4623,7 +4830,7 @@
               <w:rFonts w:cstheme="minorHAnsi"/>
               <w:noProof/>
             </w:rPr>
-            <w:t>(1)</w:t>
+            <w:t>(4)</w:t>
           </w:r>
           <w:r>
             <w:rPr>
@@ -4645,7 +4852,7 @@
       <w:pPr>
         <w:pStyle w:val="Nadpis3"/>
       </w:pPr>
-      <w:bookmarkStart w:id="17" w:name="_Toc187650066"/>
+      <w:bookmarkStart w:id="17" w:name="_Toc187737786"/>
       <w:proofErr w:type="spellStart"/>
       <w:r>
         <w:t>Visual</w:t>
@@ -4758,7 +4965,7 @@
             <w:rPr>
               <w:noProof/>
             </w:rPr>
-            <w:t>(2)</w:t>
+            <w:t>(5)</w:t>
           </w:r>
           <w:r>
             <w:fldChar w:fldCharType="end"/>
@@ -4875,7 +5082,7 @@
                                   <w:rPr>
                                     <w:noProof/>
                                   </w:rPr>
-                                  <w:t>(16)</w:t>
+                                  <w:t>(19)</w:t>
                                 </w:r>
                                 <w:r>
                                   <w:fldChar w:fldCharType="end"/>
@@ -4966,7 +5173,7 @@
                             <w:rPr>
                               <w:noProof/>
                             </w:rPr>
-                            <w:t>(16)</w:t>
+                            <w:t>(19)</w:t>
                           </w:r>
                           <w:r>
                             <w:fldChar w:fldCharType="end"/>
@@ -4988,7 +5195,7 @@
       <w:pPr>
         <w:pStyle w:val="Nadpis3"/>
       </w:pPr>
-      <w:bookmarkStart w:id="20" w:name="_Toc187650067"/>
+      <w:bookmarkStart w:id="20" w:name="_Toc187737787"/>
       <w:r>
         <w:t>C#</w:t>
       </w:r>
@@ -5121,7 +5328,7 @@
             <w:rPr>
               <w:noProof/>
             </w:rPr>
-            <w:t>(3)</w:t>
+            <w:t>(6)</w:t>
           </w:r>
           <w:r>
             <w:fldChar w:fldCharType="end"/>
@@ -5230,7 +5437,7 @@
                                   <w:rPr>
                                     <w:noProof/>
                                   </w:rPr>
-                                  <w:t>(15)</w:t>
+                                  <w:t>(18)</w:t>
                                 </w:r>
                                 <w:r>
                                   <w:fldChar w:fldCharType="end"/>
@@ -5327,7 +5534,7 @@
                             <w:rPr>
                               <w:noProof/>
                             </w:rPr>
-                            <w:t>(15)</w:t>
+                            <w:t>(18)</w:t>
                           </w:r>
                           <w:r>
                             <w:fldChar w:fldCharType="end"/>
@@ -5359,7 +5566,7 @@
       <w:pPr>
         <w:pStyle w:val="Nadpis3"/>
       </w:pPr>
-      <w:bookmarkStart w:id="23" w:name="_Toc187650068"/>
+      <w:bookmarkStart w:id="23" w:name="_Toc187737788"/>
       <w:r>
         <w:t>GitHub</w:t>
       </w:r>
@@ -5371,7 +5578,7 @@
           <w:noProof/>
         </w:rPr>
         <w:drawing>
-          <wp:anchor distT="0" distB="0" distL="114300" distR="114300" simplePos="0" relativeHeight="251674624" behindDoc="0" locked="0" layoutInCell="1" allowOverlap="1" wp14:anchorId="09A12991" wp14:editId="521BD2E2">
+          <wp:anchor distT="0" distB="0" distL="114300" distR="114300" simplePos="0" relativeHeight="251674624" behindDoc="0" locked="0" layoutInCell="1" allowOverlap="1" wp14:anchorId="09A12991" wp14:editId="04C84584">
             <wp:simplePos x="0" y="0"/>
             <wp:positionH relativeFrom="margin">
               <wp:align>left</wp:align>
@@ -5532,7 +5739,7 @@
                                   <w:rPr>
                                     <w:noProof/>
                                   </w:rPr>
-                                  <w:t>(17)</w:t>
+                                  <w:t>(20)</w:t>
                                 </w:r>
                                 <w:r>
                                   <w:fldChar w:fldCharType="end"/>
@@ -5617,7 +5824,7 @@
                             <w:rPr>
                               <w:noProof/>
                             </w:rPr>
-                            <w:t>(17)</w:t>
+                            <w:t>(20)</w:t>
                           </w:r>
                           <w:r>
                             <w:fldChar w:fldCharType="end"/>
@@ -5664,7 +5871,7 @@
           <w:noProof/>
         </w:rPr>
         <w:drawing>
-          <wp:anchor distT="0" distB="0" distL="114300" distR="114300" simplePos="0" relativeHeight="251676672" behindDoc="0" locked="0" layoutInCell="1" allowOverlap="1" wp14:anchorId="2241B8B0" wp14:editId="29CE4D12">
+          <wp:anchor distT="0" distB="0" distL="114300" distR="114300" simplePos="0" relativeHeight="251676672" behindDoc="0" locked="0" layoutInCell="1" allowOverlap="1" wp14:anchorId="2241B8B0" wp14:editId="2F986786">
             <wp:simplePos x="0" y="0"/>
             <wp:positionH relativeFrom="margin">
               <wp:posOffset>4627245</wp:posOffset>
@@ -5836,7 +6043,7 @@
                                   <w:rPr>
                                     <w:noProof/>
                                   </w:rPr>
-                                  <w:t>(18)</w:t>
+                                  <w:t>(21)</w:t>
                                 </w:r>
                                 <w:r>
                                   <w:fldChar w:fldCharType="end"/>
@@ -5928,7 +6135,7 @@
                             <w:rPr>
                               <w:noProof/>
                             </w:rPr>
-                            <w:t>(18)</w:t>
+                            <w:t>(21)</w:t>
                           </w:r>
                           <w:r>
                             <w:fldChar w:fldCharType="end"/>
@@ -5957,7 +6164,7 @@
       <w:pPr>
         <w:pStyle w:val="Nadpis3"/>
       </w:pPr>
-      <w:bookmarkStart w:id="28" w:name="_Toc187650069"/>
+      <w:bookmarkStart w:id="28" w:name="_Toc187737789"/>
       <w:proofErr w:type="spellStart"/>
       <w:r>
         <w:lastRenderedPageBreak/>
@@ -6088,7 +6295,7 @@
             <w:rPr>
               <w:noProof/>
             </w:rPr>
-            <w:t>(4)</w:t>
+            <w:t>(7)</w:t>
           </w:r>
           <w:r>
             <w:fldChar w:fldCharType="end"/>
@@ -6148,7 +6355,7 @@
             <w:rPr>
               <w:noProof/>
             </w:rPr>
-            <w:t>(5)</w:t>
+            <w:t>(8)</w:t>
           </w:r>
           <w:r>
             <w:fldChar w:fldCharType="end"/>
@@ -6165,7 +6372,7 @@
       <w:pPr>
         <w:pStyle w:val="Nadpis3"/>
       </w:pPr>
-      <w:bookmarkStart w:id="30" w:name="_Toc187650070"/>
+      <w:bookmarkStart w:id="30" w:name="_Toc187737790"/>
       <w:r>
         <w:rPr>
           <w:noProof/>
@@ -6371,7 +6578,7 @@
                                   <w:rPr>
                                     <w:noProof/>
                                   </w:rPr>
-                                  <w:t>(19)</w:t>
+                                  <w:t>(22)</w:t>
                                 </w:r>
                                 <w:r>
                                   <w:fldChar w:fldCharType="end"/>
@@ -6453,7 +6660,7 @@
                             <w:rPr>
                               <w:noProof/>
                             </w:rPr>
-                            <w:t>(19)</w:t>
+                            <w:t>(22)</w:t>
                           </w:r>
                           <w:r>
                             <w:fldChar w:fldCharType="end"/>
@@ -6503,7 +6710,7 @@
             <w:rPr>
               <w:noProof/>
             </w:rPr>
-            <w:t>(6)</w:t>
+            <w:t>(9)</w:t>
           </w:r>
           <w:r>
             <w:fldChar w:fldCharType="end"/>
@@ -6559,7 +6766,7 @@
             <w:rPr>
               <w:noProof/>
             </w:rPr>
-            <w:t>(7)</w:t>
+            <w:t>(10)</w:t>
           </w:r>
           <w:r>
             <w:fldChar w:fldCharType="end"/>
@@ -6580,7 +6787,7 @@
           <w:bottom w:val="single" w:sz="4" w:space="1" w:color="FFC000"/>
         </w:pBdr>
       </w:pPr>
-      <w:bookmarkStart w:id="33" w:name="_Toc187650071"/>
+      <w:bookmarkStart w:id="33" w:name="_Toc187737791"/>
       <w:r>
         <w:lastRenderedPageBreak/>
         <w:t>Praktická</w:t>
@@ -6600,7 +6807,7 @@
           <w:bottom w:val="single" w:sz="4" w:space="1" w:color="FFE79B"/>
         </w:pBdr>
       </w:pPr>
-      <w:bookmarkStart w:id="34" w:name="_Toc187650072"/>
+      <w:bookmarkStart w:id="34" w:name="_Toc187737792"/>
       <w:r>
         <w:t>Návrhy</w:t>
       </w:r>
@@ -6772,7 +6979,7 @@
             <w:rPr>
               <w:noProof/>
             </w:rPr>
-            <w:t>(8)</w:t>
+            <w:t>(11)</w:t>
           </w:r>
           <w:r>
             <w:fldChar w:fldCharType="end"/>
@@ -6870,7 +7077,7 @@
             <w:rPr>
               <w:noProof/>
             </w:rPr>
-            <w:t>(9)</w:t>
+            <w:t>(12)</w:t>
           </w:r>
           <w:r>
             <w:fldChar w:fldCharType="end"/>
@@ -6899,7 +7106,7 @@
             <w:rPr>
               <w:noProof/>
             </w:rPr>
-            <w:t>(10)</w:t>
+            <w:t>(13)</w:t>
           </w:r>
           <w:r>
             <w:fldChar w:fldCharType="end"/>
@@ -6919,7 +7126,7 @@
           <w:bottom w:val="single" w:sz="4" w:space="1" w:color="FFE79B"/>
         </w:pBdr>
       </w:pPr>
-      <w:bookmarkStart w:id="37" w:name="_Toc187650073"/>
+      <w:bookmarkStart w:id="37" w:name="_Toc187737793"/>
       <w:proofErr w:type="spellStart"/>
       <w:r>
         <w:lastRenderedPageBreak/>
@@ -6932,7 +7139,7 @@
       <w:pPr>
         <w:pStyle w:val="Nadpis3"/>
       </w:pPr>
-      <w:bookmarkStart w:id="38" w:name="_Toc187650074"/>
+      <w:bookmarkStart w:id="38" w:name="_Toc187737794"/>
       <w:r>
         <w:t>Kód pro výměnu kamer</w:t>
       </w:r>
@@ -12132,6 +12339,7 @@
       <w:pPr>
         <w:pStyle w:val="Nadpis3"/>
       </w:pPr>
+      <w:bookmarkStart w:id="42" w:name="_Toc187737795"/>
       <w:proofErr w:type="spellStart"/>
       <w:r>
         <w:t>Ragdoll</w:t>
@@ -12140,6 +12348,7 @@
       <w:r>
         <w:t xml:space="preserve"> kolize</w:t>
       </w:r>
+      <w:bookmarkEnd w:id="42"/>
     </w:p>
     <w:p>
       <w:r>
@@ -12244,7 +12453,7 @@
       <w:pPr>
         <w:pStyle w:val="Titulek"/>
       </w:pPr>
-      <w:bookmarkStart w:id="42" w:name="_Toc187654920"/>
+      <w:bookmarkStart w:id="43" w:name="_Toc187654920"/>
       <w:r>
         <w:t xml:space="preserve">Obrázek </w:t>
       </w:r>
@@ -12267,7 +12476,7 @@
       <w:r>
         <w:t xml:space="preserve"> kolize</w:t>
       </w:r>
-      <w:bookmarkEnd w:id="42"/>
+      <w:bookmarkEnd w:id="43"/>
     </w:p>
     <w:p>
       <w:pPr>
@@ -12311,11 +12520,11 @@
           <w:bottom w:val="single" w:sz="4" w:space="1" w:color="FFE79B"/>
         </w:pBdr>
       </w:pPr>
-      <w:bookmarkStart w:id="43" w:name="_Toc187650075"/>
+      <w:bookmarkStart w:id="44" w:name="_Toc187737796"/>
       <w:r>
         <w:t>Popis pro uživatele</w:t>
       </w:r>
-      <w:bookmarkEnd w:id="43"/>
+      <w:bookmarkEnd w:id="44"/>
     </w:p>
     <w:p>
       <w:pPr>
@@ -12337,11 +12546,11 @@
       <w:pPr>
         <w:pStyle w:val="Nadpis3"/>
       </w:pPr>
-      <w:bookmarkStart w:id="44" w:name="_Toc187650076"/>
+      <w:bookmarkStart w:id="45" w:name="_Toc187737797"/>
       <w:r>
         <w:t>Mechaniky a jejich krátký popis</w:t>
       </w:r>
-      <w:bookmarkEnd w:id="44"/>
+      <w:bookmarkEnd w:id="45"/>
     </w:p>
     <w:p>
       <w:pPr>
@@ -12457,7 +12666,7 @@
       <w:pPr>
         <w:pStyle w:val="Titulek"/>
       </w:pPr>
-      <w:bookmarkStart w:id="45" w:name="_Toc187654921"/>
+      <w:bookmarkStart w:id="46" w:name="_Toc187654921"/>
       <w:r>
         <w:t xml:space="preserve">Obrázek </w:t>
       </w:r>
@@ -12472,7 +12681,7 @@
       <w:r>
         <w:t xml:space="preserve"> | Hod objektu</w:t>
       </w:r>
-      <w:bookmarkEnd w:id="45"/>
+      <w:bookmarkEnd w:id="46"/>
     </w:p>
     <w:p>
       <w:pPr>
@@ -12749,7 +12958,7 @@
                                 <w:szCs w:val="22"/>
                               </w:rPr>
                             </w:pPr>
-                            <w:bookmarkStart w:id="46" w:name="_Toc187654922"/>
+                            <w:bookmarkStart w:id="47" w:name="_Toc187654922"/>
                             <w:r>
                               <w:t xml:space="preserve">Obrázek </w:t>
                             </w:r>
@@ -12764,7 +12973,7 @@
                             <w:r>
                               <w:t xml:space="preserve"> | Mířící kamera</w:t>
                             </w:r>
-                            <w:bookmarkEnd w:id="46"/>
+                            <w:bookmarkEnd w:id="47"/>
                           </w:p>
                         </w:txbxContent>
                       </wps:txbx>
@@ -12793,7 +13002,7 @@
                           <w:szCs w:val="22"/>
                         </w:rPr>
                       </w:pPr>
-                      <w:bookmarkStart w:id="47" w:name="_Toc187654922"/>
+                      <w:bookmarkStart w:id="48" w:name="_Toc187654922"/>
                       <w:r>
                         <w:t xml:space="preserve">Obrázek </w:t>
                       </w:r>
@@ -12808,7 +13017,7 @@
                       <w:r>
                         <w:t xml:space="preserve"> | Mířící kamera</w:t>
                       </w:r>
-                      <w:bookmarkEnd w:id="47"/>
+                      <w:bookmarkEnd w:id="48"/>
                     </w:p>
                   </w:txbxContent>
                 </v:textbox>
@@ -12922,7 +13131,7 @@
                           <w:szCs w:val="22"/>
                         </w:rPr>
                       </w:pPr>
-                      <w:bookmarkStart w:id="49" w:name="_Toc187654923"/>
+                      <w:bookmarkStart w:id="50" w:name="_Toc187654923"/>
                       <w:r>
                         <w:t xml:space="preserve">Obrázek </w:t>
                       </w:r>
@@ -12937,7 +13146,7 @@
                       <w:r>
                         <w:t xml:space="preserve"> | Hlavní kamera</w:t>
                       </w:r>
-                      <w:bookmarkEnd w:id="49"/>
+                      <w:bookmarkEnd w:id="50"/>
                     </w:p>
                   </w:txbxContent>
                 </v:textbox>
@@ -12958,20 +13167,121 @@
           <w:bottom w:val="single" w:sz="4" w:space="1" w:color="FFC000"/>
         </w:pBdr>
       </w:pPr>
-      <w:bookmarkStart w:id="50" w:name="_Toc187650077"/>
+      <w:bookmarkStart w:id="49" w:name="_Toc187737798"/>
       <w:r>
         <w:lastRenderedPageBreak/>
         <w:t>Závěr</w:t>
       </w:r>
-      <w:bookmarkEnd w:id="50"/>
+      <w:bookmarkEnd w:id="49"/>
+    </w:p>
+    <w:p>
+      <w:pPr>
+        <w:ind w:firstLine="357"/>
+      </w:pPr>
+      <w:r>
+        <w:t>Cílem projektu za tento půl-rok bylo vytvořit plně funkční a hratelnou hru, což se z mého pohledu zdaleka nepovedlo, tak jsem chtěl, a tak jak jsem si představoval. Hned prvním faktorem toho, že se mi nedařilo plnit cíle na 100 % bylo, že se mi 20.11.2024 zničil notebook. Následně byl odeslán do servisu, kde nastali další komplikace a notebook mi přišel až 8.1.2025. Od školy jsem si vypůjčil stolní počítač před Vánoci abych mohl aspoň v mezičase nějak pracovat.</w:t>
+      </w:r>
+    </w:p>
+    <w:p>
+      <w:pPr>
+        <w:ind w:firstLine="357"/>
+      </w:pPr>
+      <w:r>
+        <w:t xml:space="preserve">Cíle, které jsem si vytyčil, že splním do prvních obhajob byly splněny tak na </w:t>
+      </w:r>
+      <w:r>
+        <w:t xml:space="preserve">70 </w:t>
+      </w:r>
+      <w:r>
+        <w:t xml:space="preserve">%. </w:t>
+      </w:r>
+      <w:r>
+        <w:t>Nejvíce času mi zabralo učení se s novými funkcemi ať už v Unity, nebo v knihovnách, dále taktéž psaní kódu</w:t>
+      </w:r>
+      <w:r>
+        <w:t xml:space="preserve"> a seřizování animací</w:t>
+      </w:r>
+      <w:r>
+        <w:t xml:space="preserve">. </w:t>
+      </w:r>
+      <w:r>
+        <w:t xml:space="preserve">Mapy jsou např. jeden z cílů, který jsem nesplnil, do obhajob mám jen jednu kratší mapu místo tří celých a vyšperkovaných map. Skok a jeho animace mi stále celkem dělá problém, </w:t>
+      </w:r>
+      <w:r>
+        <w:t xml:space="preserve">chtěl jsem si již hotovou animaci skoku rozkouskovat na výskok, let a přistání, tento plán ale moc nevyšel z důvodu </w:t>
+      </w:r>
+      <w:proofErr w:type="spellStart"/>
+      <w:r>
+        <w:t>probugovávání</w:t>
+      </w:r>
+      <w:proofErr w:type="spellEnd"/>
+      <w:r>
+        <w:t xml:space="preserve"> textur při animaci letu. Měl jsem v plánu taktéž dělat pasti, překážky a jejich funkčnost, což jsem taky nestíhal. Další cíl byly checkpointy, splnil jsem to, že padá cedule z nebe na určitém místě, ale nesplnil jsem, že ta cedule má nějaký efekt na hru, dotyk hlavní postavy s touto cedulí měl totiž uložit herní postup, dokud jednou hráč nezemře.</w:t>
+      </w:r>
+    </w:p>
+    <w:p>
+      <w:pPr>
+        <w:ind w:firstLine="357"/>
+      </w:pPr>
+      <w:r>
+        <w:t xml:space="preserve">Úkolů, co jsem splnil </w:t>
+      </w:r>
+      <w:r>
+        <w:t>není</w:t>
+      </w:r>
+      <w:r>
+        <w:t xml:space="preserve"> ale, jak jsem říkal, </w:t>
+      </w:r>
+      <w:r>
+        <w:t xml:space="preserve">i k mému údivu, až tak málo. Našel jsem si dvě hlavní postavy s animacemi a zprovoznil je ve hře. Těmto dvěma postavám jsem udělal jak manuální </w:t>
+      </w:r>
+      <w:proofErr w:type="spellStart"/>
+      <w:r>
+        <w:t>ragdoll</w:t>
+      </w:r>
+      <w:proofErr w:type="spellEnd"/>
+      <w:r>
+        <w:t xml:space="preserve">, tak i ten automatický, ten se nachází při úmrtí. Splnil jsem možnost brát a házet </w:t>
+      </w:r>
+      <w:proofErr w:type="spellStart"/>
+      <w:r>
+        <w:t>itemy</w:t>
+      </w:r>
+      <w:proofErr w:type="spellEnd"/>
+      <w:r>
+        <w:t xml:space="preserve"> a s tím spojené přepínání kamer mezi mířící kamerou a kamerou s pohledem ze třetí osoby pomocí pravého kliknutí myši</w:t>
+      </w:r>
+      <w:r>
+        <w:t xml:space="preserve"> a </w:t>
+      </w:r>
+      <w:r>
+        <w:t xml:space="preserve">k tomu </w:t>
+      </w:r>
+      <w:proofErr w:type="spellStart"/>
+      <w:r>
+        <w:t>crosshair</w:t>
+      </w:r>
+      <w:proofErr w:type="spellEnd"/>
+      <w:r>
+        <w:t xml:space="preserve"> </w:t>
+      </w:r>
+      <w:r>
+        <w:t xml:space="preserve">pro míření. Dále jsem vytvořil lektvary pro zlepšení schopností hlavní postavy, jmenovitě to jsou: lektvar pro zpomalení času, lektvar pro zrychlení a lektvar pro super skok. </w:t>
+      </w:r>
     </w:p>
     <w:p>
       <w:r>
         <w:br w:type="page"/>
       </w:r>
     </w:p>
+    <w:bookmarkStart w:id="50" w:name="_Toc187737799" w:displacedByCustomXml="next"/>
     <w:sdt>
       <w:sdtPr>
+        <w:rPr>
+          <w:rFonts w:asciiTheme="minorHAnsi" w:eastAsiaTheme="minorEastAsia" w:hAnsiTheme="minorHAnsi" w:cstheme="minorBidi"/>
+          <w:sz w:val="22"/>
+          <w:szCs w:val="22"/>
+        </w:rPr>
         <w:id w:val="-225462132"/>
         <w:docPartObj>
           <w:docPartGallery w:val="Bibliographies"/>
@@ -12980,11 +13290,8 @@
       </w:sdtPr>
       <w:sdtEndPr>
         <w:rPr>
-          <w:rFonts w:asciiTheme="minorHAnsi" w:eastAsiaTheme="minorEastAsia" w:hAnsiTheme="minorHAnsi" w:cstheme="minorBidi"/>
           <w:b/>
           <w:bCs/>
-          <w:sz w:val="22"/>
-          <w:szCs w:val="22"/>
         </w:rPr>
       </w:sdtEndPr>
       <w:sdtContent>
@@ -12995,6 +13302,7 @@
           <w:r>
             <w:t>Použitá literatura</w:t>
           </w:r>
+          <w:bookmarkEnd w:id="50"/>
         </w:p>
         <w:p>
           <w:pPr>
@@ -13028,7 +13336,115 @@
               <w:bCs/>
               <w:noProof/>
             </w:rPr>
-            <w:t xml:space="preserve">Programming and scripting with Unity. </w:t>
+            <w:t xml:space="preserve">PROČ SI TO ZAS DĚLÁM?! ALTF4 - Youtube. </w:t>
+          </w:r>
+          <w:r>
+            <w:rPr>
+              <w:b/>
+              <w:bCs/>
+              <w:i/>
+              <w:iCs/>
+              <w:noProof/>
+            </w:rPr>
+            <w:t xml:space="preserve">Youtube. </w:t>
+          </w:r>
+          <w:r>
+            <w:rPr>
+              <w:b/>
+              <w:bCs/>
+              <w:noProof/>
+            </w:rPr>
+            <w:t>[Online] [Citace: 14. 1. 2025.] https://www.youtube.com/watch?v=LWt7xg_fC3A.</w:t>
+          </w:r>
+        </w:p>
+        <w:p>
+          <w:pPr>
+            <w:pStyle w:val="Bibliografie"/>
+            <w:rPr>
+              <w:b/>
+              <w:bCs/>
+              <w:noProof/>
+            </w:rPr>
+          </w:pPr>
+          <w:r>
+            <w:rPr>
+              <w:b/>
+              <w:bCs/>
+              <w:noProof/>
+            </w:rPr>
+            <w:t xml:space="preserve">2. Osobní rekord! - Jump King - Youtube. </w:t>
+          </w:r>
+          <w:r>
+            <w:rPr>
+              <w:b/>
+              <w:bCs/>
+              <w:i/>
+              <w:iCs/>
+              <w:noProof/>
+            </w:rPr>
+            <w:t xml:space="preserve">Youtube. </w:t>
+          </w:r>
+          <w:r>
+            <w:rPr>
+              <w:b/>
+              <w:bCs/>
+              <w:noProof/>
+            </w:rPr>
+            <w:t>[Online] [Citace: 14. 1. 2025.] https://www.youtube.com/watch?v=O-GC_eLPoek.</w:t>
+          </w:r>
+        </w:p>
+        <w:p>
+          <w:pPr>
+            <w:pStyle w:val="Bibliografie"/>
+            <w:rPr>
+              <w:b/>
+              <w:bCs/>
+              <w:noProof/>
+            </w:rPr>
+          </w:pPr>
+          <w:r>
+            <w:rPr>
+              <w:b/>
+              <w:bCs/>
+              <w:noProof/>
+            </w:rPr>
+            <w:t xml:space="preserve">3. PIJU pokaždé, když se rozsekám ve VOZÍKU! - Youtube. </w:t>
+          </w:r>
+          <w:r>
+            <w:rPr>
+              <w:b/>
+              <w:bCs/>
+              <w:i/>
+              <w:iCs/>
+              <w:noProof/>
+            </w:rPr>
+            <w:t xml:space="preserve">Youtube. </w:t>
+          </w:r>
+          <w:r>
+            <w:rPr>
+              <w:b/>
+              <w:bCs/>
+              <w:noProof/>
+            </w:rPr>
+            <w:t>[Online] [Citace: 14. 1. 2025.] https://www.youtube.com/watch?v=FAfCs4zXMYw&amp;list=PLIO7VUzfNfIVBBfZGrYQlx3k1-sp9WInZ&amp;index=6.</w:t>
+          </w:r>
+        </w:p>
+        <w:p>
+          <w:pPr>
+            <w:pStyle w:val="Bibliografie"/>
+            <w:rPr>
+              <w:b/>
+              <w:bCs/>
+              <w:noProof/>
+            </w:rPr>
+          </w:pPr>
+          <w:r>
+            <w:rPr>
+              <w:b/>
+              <w:bCs/>
+              <w:noProof/>
+            </w:rPr>
+            <w:t xml:space="preserve">4. Programming and scripting with Unity. </w:t>
           </w:r>
           <w:r>
             <w:rPr>
@@ -13064,7 +13480,7 @@
               <w:bCs/>
               <w:noProof/>
             </w:rPr>
-            <w:t xml:space="preserve">2. Visual Studio 2022 IDE - programovací jazyk pro vývojáře software. </w:t>
+            <w:t xml:space="preserve">5. Visual Studio 2022 IDE - programovací jazyk pro vývojáře software. </w:t>
           </w:r>
           <w:r>
             <w:rPr>
@@ -13100,7 +13516,7 @@
               <w:bCs/>
               <w:noProof/>
             </w:rPr>
-            <w:t xml:space="preserve">3. A tour of the C# - Overwiev - C# | Microsoft Learn. </w:t>
+            <w:t xml:space="preserve">6. A tour of the C# - Overwiev - C# | Microsoft Learn. </w:t>
           </w:r>
           <w:r>
             <w:rPr>
@@ -13119,114 +13535,6 @@
               <w:noProof/>
             </w:rPr>
             <w:t>[Online] [Citace: 13. 1. 2025.] https://learn.microsoft.com/en-us/dotnet/csharp/tour-of-csharp/.</w:t>
-          </w:r>
-        </w:p>
-        <w:p>
-          <w:pPr>
-            <w:pStyle w:val="Bibliografie"/>
-            <w:rPr>
-              <w:b/>
-              <w:bCs/>
-              <w:noProof/>
-            </w:rPr>
-          </w:pPr>
-          <w:r>
-            <w:rPr>
-              <w:b/>
-              <w:bCs/>
-              <w:noProof/>
-            </w:rPr>
-            <w:t xml:space="preserve">4. ChatGPT popis a parafráze. </w:t>
-          </w:r>
-          <w:r>
-            <w:rPr>
-              <w:b/>
-              <w:bCs/>
-              <w:i/>
-              <w:iCs/>
-              <w:noProof/>
-            </w:rPr>
-            <w:t xml:space="preserve">ChatGPT. </w:t>
-          </w:r>
-          <w:r>
-            <w:rPr>
-              <w:b/>
-              <w:bCs/>
-              <w:noProof/>
-            </w:rPr>
-            <w:t>[Online] [Citace: 13. 1. 2025.] https://chatgpt.com/share/678577c5-76f0-8007-baf4-82cd62827d5d.</w:t>
-          </w:r>
-        </w:p>
-        <w:p>
-          <w:pPr>
-            <w:pStyle w:val="Bibliografie"/>
-            <w:rPr>
-              <w:b/>
-              <w:bCs/>
-              <w:noProof/>
-            </w:rPr>
-          </w:pPr>
-          <w:r>
-            <w:rPr>
-              <w:b/>
-              <w:bCs/>
-              <w:noProof/>
-            </w:rPr>
-            <w:t xml:space="preserve">5. Chatgpt Vector Logo - Download Free. </w:t>
-          </w:r>
-          <w:r>
-            <w:rPr>
-              <w:b/>
-              <w:bCs/>
-              <w:i/>
-              <w:iCs/>
-              <w:noProof/>
-            </w:rPr>
-            <w:t xml:space="preserve">World Vector Logo. </w:t>
-          </w:r>
-          <w:r>
-            <w:rPr>
-              <w:b/>
-              <w:bCs/>
-              <w:noProof/>
-            </w:rPr>
-            <w:t>[Online] [Citace: 13. 1. 2025.] https://worldvectorlogo.com/logo/chatgpt-6.</w:t>
-          </w:r>
-        </w:p>
-        <w:p>
-          <w:pPr>
-            <w:pStyle w:val="Bibliografie"/>
-            <w:rPr>
-              <w:b/>
-              <w:bCs/>
-              <w:noProof/>
-            </w:rPr>
-          </w:pPr>
-          <w:r>
-            <w:rPr>
-              <w:b/>
-              <w:bCs/>
-              <w:noProof/>
-            </w:rPr>
-            <w:t xml:space="preserve">6. ChatGPT popis a parafráze. </w:t>
-          </w:r>
-          <w:r>
-            <w:rPr>
-              <w:b/>
-              <w:bCs/>
-              <w:i/>
-              <w:iCs/>
-              <w:noProof/>
-            </w:rPr>
-            <w:t xml:space="preserve">ChatGPT. </w:t>
-          </w:r>
-          <w:r>
-            <w:rPr>
-              <w:b/>
-              <w:bCs/>
-              <w:noProof/>
-            </w:rPr>
-            <w:t>[Online] [Citace: 13. 1. 2025.] https://chatgpt.com/share/678577c5-76f0-8007-baf4-82cd62827d5d.</w:t>
           </w:r>
         </w:p>
         <w:p>
@@ -13280,7 +13588,115 @@
               <w:bCs/>
               <w:noProof/>
             </w:rPr>
-            <w:t xml:space="preserve">8. Anton Puzanov - Asset Store. </w:t>
+            <w:t xml:space="preserve">8. Chatgpt Vector Logo - Download Free. </w:t>
+          </w:r>
+          <w:r>
+            <w:rPr>
+              <w:b/>
+              <w:bCs/>
+              <w:i/>
+              <w:iCs/>
+              <w:noProof/>
+            </w:rPr>
+            <w:t xml:space="preserve">World Vector Logo. </w:t>
+          </w:r>
+          <w:r>
+            <w:rPr>
+              <w:b/>
+              <w:bCs/>
+              <w:noProof/>
+            </w:rPr>
+            <w:t>[Online] [Citace: 13. 1. 2025.] https://worldvectorlogo.com/logo/chatgpt-6.</w:t>
+          </w:r>
+        </w:p>
+        <w:p>
+          <w:pPr>
+            <w:pStyle w:val="Bibliografie"/>
+            <w:rPr>
+              <w:b/>
+              <w:bCs/>
+              <w:noProof/>
+            </w:rPr>
+          </w:pPr>
+          <w:r>
+            <w:rPr>
+              <w:b/>
+              <w:bCs/>
+              <w:noProof/>
+            </w:rPr>
+            <w:t xml:space="preserve">9. ChatGPT popis a parafráze. </w:t>
+          </w:r>
+          <w:r>
+            <w:rPr>
+              <w:b/>
+              <w:bCs/>
+              <w:i/>
+              <w:iCs/>
+              <w:noProof/>
+            </w:rPr>
+            <w:t xml:space="preserve">ChatGPT. </w:t>
+          </w:r>
+          <w:r>
+            <w:rPr>
+              <w:b/>
+              <w:bCs/>
+              <w:noProof/>
+            </w:rPr>
+            <w:t>[Online] [Citace: 13. 1. 2025.] https://chatgpt.com/share/678577c5-76f0-8007-baf4-82cd62827d5d.</w:t>
+          </w:r>
+        </w:p>
+        <w:p>
+          <w:pPr>
+            <w:pStyle w:val="Bibliografie"/>
+            <w:rPr>
+              <w:b/>
+              <w:bCs/>
+              <w:noProof/>
+            </w:rPr>
+          </w:pPr>
+          <w:r>
+            <w:rPr>
+              <w:b/>
+              <w:bCs/>
+              <w:noProof/>
+            </w:rPr>
+            <w:t xml:space="preserve">10. ChatGPT popis a parafráze. </w:t>
+          </w:r>
+          <w:r>
+            <w:rPr>
+              <w:b/>
+              <w:bCs/>
+              <w:i/>
+              <w:iCs/>
+              <w:noProof/>
+            </w:rPr>
+            <w:t xml:space="preserve">ChatGPT. </w:t>
+          </w:r>
+          <w:r>
+            <w:rPr>
+              <w:b/>
+              <w:bCs/>
+              <w:noProof/>
+            </w:rPr>
+            <w:t>[Online] [Citace: 13. 1. 2025.] https://chatgpt.com/share/678577c5-76f0-8007-baf4-82cd62827d5d.</w:t>
+          </w:r>
+        </w:p>
+        <w:p>
+          <w:pPr>
+            <w:pStyle w:val="Bibliografie"/>
+            <w:rPr>
+              <w:b/>
+              <w:bCs/>
+              <w:noProof/>
+            </w:rPr>
+          </w:pPr>
+          <w:r>
+            <w:rPr>
+              <w:b/>
+              <w:bCs/>
+              <w:noProof/>
+            </w:rPr>
+            <w:t xml:space="preserve">11. Anton Puzanov - Asset Store. </w:t>
           </w:r>
           <w:r>
             <w:rPr>
@@ -13316,7 +13732,7 @@
               <w:bCs/>
               <w:noProof/>
             </w:rPr>
-            <w:t xml:space="preserve">9. Warrior 3 | Characters | Unity Asset Store. </w:t>
+            <w:t xml:space="preserve">12. Warrior 3 | Characters | Unity Asset Store. </w:t>
           </w:r>
           <w:r>
             <w:rPr>
@@ -13352,7 +13768,7 @@
               <w:bCs/>
               <w:noProof/>
             </w:rPr>
-            <w:t xml:space="preserve">10. Warrior Maiden | 3D animals | Unity Asset Store. </w:t>
+            <w:t xml:space="preserve">13. Warrior Maiden | 3D animals | Unity Asset Store. </w:t>
           </w:r>
           <w:r>
             <w:rPr>
@@ -13388,7 +13804,7 @@
               <w:bCs/>
               <w:noProof/>
             </w:rPr>
-            <w:t xml:space="preserve">11. ALTF4 ve službě Steam. </w:t>
+            <w:t xml:space="preserve">14. ALTF4 ve službě Steam. </w:t>
           </w:r>
           <w:r>
             <w:rPr>
@@ -13424,7 +13840,7 @@
               <w:bCs/>
               <w:noProof/>
             </w:rPr>
-            <w:t xml:space="preserve">12. Jump King ve službě Steam. </w:t>
+            <w:t xml:space="preserve">15. Jump King ve službě Steam. </w:t>
           </w:r>
           <w:r>
             <w:rPr>
@@ -13460,7 +13876,7 @@
               <w:bCs/>
               <w:noProof/>
             </w:rPr>
-            <w:t xml:space="preserve">13. Slackers - Carts of Glory ve službě Steam. </w:t>
+            <w:t xml:space="preserve">16. Slackers - Carts of Glory ve službě Steam. </w:t>
           </w:r>
           <w:r>
             <w:rPr>
@@ -13496,7 +13912,7 @@
               <w:bCs/>
               <w:noProof/>
             </w:rPr>
-            <w:t xml:space="preserve">14. Unity 3D. </w:t>
+            <w:t xml:space="preserve">17. Unity 3D. </w:t>
           </w:r>
           <w:r>
             <w:rPr>
@@ -13532,7 +13948,7 @@
               <w:bCs/>
               <w:noProof/>
             </w:rPr>
-            <w:t xml:space="preserve">15. Exercises C# - Aplikace na Google Play. </w:t>
+            <w:t xml:space="preserve">18. Exercises C# - Aplikace na Google Play. </w:t>
           </w:r>
           <w:r>
             <w:rPr>
@@ -13568,7 +13984,8 @@
               <w:bCs/>
               <w:noProof/>
             </w:rPr>
-            <w:t xml:space="preserve">16. Visual Studio Community 2022 - Aplikace Microsoft. </w:t>
+            <w:lastRenderedPageBreak/>
+            <w:t xml:space="preserve">19. Visual Studio Community 2022 - Aplikace Microsoft. </w:t>
           </w:r>
           <w:r>
             <w:rPr>
@@ -13604,7 +14021,7 @@
               <w:bCs/>
               <w:noProof/>
             </w:rPr>
-            <w:t xml:space="preserve">17. GitHub — A Beginner’s Introduction | by Thiago Marsal Farias | Dec, 2023 | Medium. </w:t>
+            <w:t xml:space="preserve">20. GitHub — A Beginner’s Introduction | by Thiago Marsal Farias | Dec, 2023 | Medium. </w:t>
           </w:r>
           <w:r>
             <w:rPr>
@@ -13640,7 +14057,7 @@
               <w:bCs/>
               <w:noProof/>
             </w:rPr>
-            <w:t xml:space="preserve">18. File:Github-desktop-logo-symbol.svg - Wikipedia. </w:t>
+            <w:t xml:space="preserve">21. File:Github-desktop-logo-symbol.svg - Wikipedia. </w:t>
           </w:r>
           <w:r>
             <w:rPr>
@@ -13676,8 +14093,7 @@
               <w:bCs/>
               <w:noProof/>
             </w:rPr>
-            <w:lastRenderedPageBreak/>
-            <w:t xml:space="preserve">19. CinemachineExternalCamera -. </w:t>
+            <w:t xml:space="preserve">22. CinemachineExternalCamera -. </w:t>
           </w:r>
           <w:r>
             <w:rPr>
@@ -13721,7 +14137,7 @@
           <w:bottom w:val="single" w:sz="4" w:space="1" w:color="FFC000"/>
         </w:pBdr>
       </w:pPr>
-      <w:bookmarkStart w:id="51" w:name="_Toc187650079"/>
+      <w:bookmarkStart w:id="51" w:name="_Toc187737800"/>
       <w:r>
         <w:lastRenderedPageBreak/>
         <w:t>Seznam obrázků</w:t>
@@ -14949,7 +15365,7 @@
           <w:bottom w:val="single" w:sz="4" w:space="1" w:color="FFC000"/>
         </w:pBdr>
       </w:pPr>
-      <w:bookmarkStart w:id="52" w:name="_Toc187650080"/>
+      <w:bookmarkStart w:id="52" w:name="_Toc187737801"/>
       <w:r>
         <w:lastRenderedPageBreak/>
         <w:t>Obsah média</w:t>
@@ -17523,7 +17939,7 @@
     <b:MonthAccessed>1.</b:MonthAccessed>
     <b:DayAccessed>13</b:DayAccessed>
     <b:URL>https://store.steampowered.com/app/1137460/ALTF4/?l=czech</b:URL>
-    <b:RefOrder>11</b:RefOrder>
+    <b:RefOrder>14</b:RefOrder>
   </b:Source>
   <b:Source>
     <b:Tag>Jum25</b:Tag>
@@ -17535,7 +17951,7 @@
     <b:MonthAccessed>1.</b:MonthAccessed>
     <b:DayAccessed>13</b:DayAccessed>
     <b:URL>https://store.steampowered.com/app/1061090/Jump_King/</b:URL>
-    <b:RefOrder>12</b:RefOrder>
+    <b:RefOrder>15</b:RefOrder>
   </b:Source>
   <b:Source>
     <b:Tag>Sla25</b:Tag>
@@ -17547,7 +17963,7 @@
     <b:MonthAccessed>1.</b:MonthAccessed>
     <b:DayAccessed>13</b:DayAccessed>
     <b:URL>https://store.steampowered.com/app/2354000/Slackers__Carts_of_Glory/</b:URL>
-    <b:RefOrder>13</b:RefOrder>
+    <b:RefOrder>16</b:RefOrder>
   </b:Source>
   <b:Source>
     <b:Tag>Pro25</b:Tag>
@@ -17559,7 +17975,7 @@
     <b:MonthAccessed>1.</b:MonthAccessed>
     <b:DayAccessed>13</b:DayAccessed>
     <b:URL>https://unity.com/solutions/programming</b:URL>
-    <b:RefOrder>1</b:RefOrder>
+    <b:RefOrder>4</b:RefOrder>
   </b:Source>
   <b:Source>
     <b:Tag>Uni25</b:Tag>
@@ -17571,7 +17987,7 @@
     <b:MonthAccessed>1.</b:MonthAccessed>
     <b:DayAccessed>13</b:DayAccessed>
     <b:URL>https://www.facebook.com/unity3d/</b:URL>
-    <b:RefOrder>14</b:RefOrder>
+    <b:RefOrder>17</b:RefOrder>
   </b:Source>
   <b:Source>
     <b:Tag>Ato25</b:Tag>
@@ -17583,7 +17999,7 @@
     <b:MonthAccessed>1.</b:MonthAccessed>
     <b:DayAccessed>13</b:DayAccessed>
     <b:URL>https://learn.microsoft.com/en-us/dotnet/csharp/tour-of-csharp/</b:URL>
-    <b:RefOrder>3</b:RefOrder>
+    <b:RefOrder>6</b:RefOrder>
   </b:Source>
   <b:Source>
     <b:Tag>Exe25</b:Tag>
@@ -17595,7 +18011,7 @@
     <b:MonthAccessed>1.</b:MonthAccessed>
     <b:DayAccessed>13</b:DayAccessed>
     <b:URL>https://play.google.com/store/apps/details?id=juanantonioripoll.practiceexercisescsharp&amp;hl=cs</b:URL>
-    <b:RefOrder>15</b:RefOrder>
+    <b:RefOrder>18</b:RefOrder>
   </b:Source>
   <b:Source>
     <b:Tag>Vis25</b:Tag>
@@ -17607,7 +18023,7 @@
     <b:MonthAccessed>1.</b:MonthAccessed>
     <b:DayAccessed>13</b:DayAccessed>
     <b:URL>https://visualstudio.microsoft.com/cs/vs/</b:URL>
-    <b:RefOrder>2</b:RefOrder>
+    <b:RefOrder>5</b:RefOrder>
   </b:Source>
   <b:Source>
     <b:Tag>Vis251</b:Tag>
@@ -17619,7 +18035,7 @@
     <b:MonthAccessed>1.</b:MonthAccessed>
     <b:DayAccessed>13</b:DayAccessed>
     <b:URL>https://apps.microsoft.com/detail/XPDCFJDKLZJLP8?hl=cs-CZ&amp;gl=CL</b:URL>
-    <b:RefOrder>16</b:RefOrder>
+    <b:RefOrder>19</b:RefOrder>
   </b:Source>
   <b:Source>
     <b:Tag>Git25</b:Tag>
@@ -17631,7 +18047,7 @@
     <b:MonthAccessed>1.</b:MonthAccessed>
     <b:DayAccessed>13</b:DayAccessed>
     <b:URL>https://thiago-marsal.medium.com/github-a-beginners-introduction-00046817208a</b:URL>
-    <b:RefOrder>17</b:RefOrder>
+    <b:RefOrder>20</b:RefOrder>
   </b:Source>
   <b:Source>
     <b:Tag>Fil25</b:Tag>
@@ -17643,7 +18059,7 @@
     <b:MonthAccessed>1.</b:MonthAccessed>
     <b:DayAccessed>13</b:DayAccessed>
     <b:URL>https://en.m.wikipedia.org/wiki/File:Github-desktop-logo-symbol.svg</b:URL>
-    <b:RefOrder>18</b:RefOrder>
+    <b:RefOrder>21</b:RefOrder>
   </b:Source>
   <b:Source>
     <b:Tag>Cha25</b:Tag>
@@ -17655,7 +18071,7 @@
     <b:MonthAccessed>1.</b:MonthAccessed>
     <b:DayAccessed>13</b:DayAccessed>
     <b:URL>https://worldvectorlogo.com/logo/chatgpt-6</b:URL>
-    <b:RefOrder>5</b:RefOrder>
+    <b:RefOrder>8</b:RefOrder>
   </b:Source>
   <b:Source>
     <b:Tag>Cha251</b:Tag>
@@ -17667,7 +18083,7 @@
     <b:MonthAccessed>1.</b:MonthAccessed>
     <b:DayAccessed>13</b:DayAccessed>
     <b:URL>https://chatgpt.com/share/678577c5-76f0-8007-baf4-82cd62827d5d</b:URL>
-    <b:RefOrder>4</b:RefOrder>
+    <b:RefOrder>7</b:RefOrder>
   </b:Source>
   <b:Source>
     <b:Tag>Cha252</b:Tag>
@@ -17679,7 +18095,7 @@
     <b:MonthAccessed>1.</b:MonthAccessed>
     <b:DayAccessed>13</b:DayAccessed>
     <b:URL>https://chatgpt.com/share/678577c5-76f0-8007-baf4-82cd62827d5d</b:URL>
-    <b:RefOrder>6</b:RefOrder>
+    <b:RefOrder>9</b:RefOrder>
   </b:Source>
   <b:Source>
     <b:Tag>Cha253</b:Tag>
@@ -17691,7 +18107,7 @@
     <b:MonthAccessed>1.</b:MonthAccessed>
     <b:DayAccessed>13</b:DayAccessed>
     <b:URL>https://chatgpt.com/share/678577c5-76f0-8007-baf4-82cd62827d5d</b:URL>
-    <b:RefOrder>7</b:RefOrder>
+    <b:RefOrder>10</b:RefOrder>
   </b:Source>
   <b:Source>
     <b:Tag>Cin25</b:Tag>
@@ -17703,7 +18119,7 @@
     <b:MonthAccessed>1.</b:MonthAccessed>
     <b:DayAccessed>13</b:DayAccessed>
     <b:URL>https://documentation.help/Cinemachine/b80f823a-e6de-2e54-8da3-7a269e4f3771.htm</b:URL>
-    <b:RefOrder>19</b:RefOrder>
+    <b:RefOrder>22</b:RefOrder>
   </b:Source>
   <b:Source>
     <b:Tag>War25</b:Tag>
@@ -17715,7 +18131,7 @@
     <b:MonthAccessed>1.</b:MonthAccessed>
     <b:DayAccessed>13</b:DayAccessed>
     <b:URL>https://assetstore.unity.com/packages/3d/characters/humanoids/fantasy/warrior-3-180877</b:URL>
-    <b:RefOrder>9</b:RefOrder>
+    <b:RefOrder>12</b:RefOrder>
   </b:Source>
   <b:Source>
     <b:Tag>War251</b:Tag>
@@ -17727,7 +18143,7 @@
     <b:MonthAccessed>1.</b:MonthAccessed>
     <b:DayAccessed>13</b:DayAccessed>
     <b:URL>https://assetstore.unity.com/packages/3d/characters/animals/warrior-maiden-156715</b:URL>
-    <b:RefOrder>10</b:RefOrder>
+    <b:RefOrder>13</b:RefOrder>
   </b:Source>
   <b:Source>
     <b:Tag>Ant25</b:Tag>
@@ -17739,7 +18155,43 @@
     <b:MonthAccessed>1.</b:MonthAccessed>
     <b:DayAccessed>13</b:DayAccessed>
     <b:URL>https://assetstore.unity.com/publishers/43856</b:URL>
-    <b:RefOrder>8</b:RefOrder>
+    <b:RefOrder>11</b:RefOrder>
+  </b:Source>
+  <b:Source>
+    <b:Tag>PRO25</b:Tag>
+    <b:SourceType>InternetSite</b:SourceType>
+    <b:Guid>{B78A4E0A-2224-4154-9094-A5E85B704650}</b:Guid>
+    <b:Title>PROČ SI TO ZAS DĚLÁM?! ALTF4 - Youtube</b:Title>
+    <b:InternetSiteTitle>Youtube</b:InternetSiteTitle>
+    <b:YearAccessed>2025</b:YearAccessed>
+    <b:MonthAccessed>1.</b:MonthAccessed>
+    <b:DayAccessed>14</b:DayAccessed>
+    <b:URL>https://www.youtube.com/watch?v=LWt7xg_fC3A</b:URL>
+    <b:RefOrder>1</b:RefOrder>
+  </b:Source>
+  <b:Source>
+    <b:Tag>Oso25</b:Tag>
+    <b:SourceType>InternetSite</b:SourceType>
+    <b:Guid>{D4E3A638-8DE1-4AD7-9477-1E598ED2F7D2}</b:Guid>
+    <b:Title>Osobní rekord! - Jump King - Youtube</b:Title>
+    <b:InternetSiteTitle>Youtube</b:InternetSiteTitle>
+    <b:YearAccessed>2025</b:YearAccessed>
+    <b:MonthAccessed>1.</b:MonthAccessed>
+    <b:DayAccessed>14</b:DayAccessed>
+    <b:URL>https://www.youtube.com/watch?v=O-GC_eLPoek</b:URL>
+    <b:RefOrder>2</b:RefOrder>
+  </b:Source>
+  <b:Source>
+    <b:Tag>PIJ25</b:Tag>
+    <b:SourceType>InternetSite</b:SourceType>
+    <b:Guid>{6C424CC6-710A-4513-A0A8-B40DDC464AD3}</b:Guid>
+    <b:Title>PIJU pokaždé, když se rozsekám ve VOZÍKU! - Youtube</b:Title>
+    <b:InternetSiteTitle>Youtube</b:InternetSiteTitle>
+    <b:YearAccessed>2025</b:YearAccessed>
+    <b:MonthAccessed>1.</b:MonthAccessed>
+    <b:DayAccessed>14</b:DayAccessed>
+    <b:URL>https://www.youtube.com/watch?v=FAfCs4zXMYw&amp;list=PLIO7VUzfNfIVBBfZGrYQlx3k1-sp9WInZ&amp;index=6</b:URL>
+    <b:RefOrder>3</b:RefOrder>
   </b:Source>
 </b:Sources>
 </file>
@@ -17781,7 +18233,7 @@
 </file>
 
 <file path=customXml/itemProps4.xml><?xml version="1.0" encoding="utf-8"?>
-<ds:datastoreItem xmlns:ds="http://schemas.openxmlformats.org/officeDocument/2006/customXml" ds:itemID="{B512C302-BB19-4F9A-99C9-9918B10E50A7}">
+<ds:datastoreItem xmlns:ds="http://schemas.openxmlformats.org/officeDocument/2006/customXml" ds:itemID="{0A326BF4-9AE7-432B-B6C9-1B7BBFEA15D4}">
   <ds:schemaRefs>
     <ds:schemaRef ds:uri="http://schemas.openxmlformats.org/officeDocument/2006/bibliography"/>
   </ds:schemaRefs>

</xml_diff>